<commit_message>
Reposition resume as entrepreneurial builder, split into main/master CV tiers
Rewrite the summary and core skills to lead with the self-taught,
entrepreneurial/founder angle (Hell's Gate Consulting, RepoScaffold,
CueQueue) instead of generic corporate-speak, promote LMG Security into
Core Skills, and reframe AI/agentic tooling as active R&D rather than
overstated production claims. Trim resume.tex back to its intended
2-page main-resume role and split the full history out into
docs/master_cv.tex as the source-of-truth CV. Regenerate the ATS-friendly
DOCX twin to match. Also does some overdue git gardening: gitignore
.claude/, and archive the Wipro-specific and stale AI-drafted minis that
had accumulated untracked.

Co-Authored-By: Claude Sonnet 5 <noreply@anthropic.com>
</commit_message>
<xml_diff>
--- a/docs/word_doc_version/Blair_Gemmer_Resume.docx
+++ b/docs/word_doc_version/Blair_Gemmer_Resume.docx
@@ -3,268 +3,108 @@
 <w:document xmlns:wpc="http://schemas.microsoft.com/office/word/2010/wordprocessingCanvas" xmlns:mc="http://schemas.openxmlformats.org/markup-compatibility/2006" xmlns:o="urn:schemas-microsoft-com:office:office" xmlns:r="http://schemas.openxmlformats.org/officeDocument/2006/relationships" xmlns:m="http://schemas.openxmlformats.org/officeDocument/2006/math" xmlns:v="urn:schemas-microsoft-com:vml" xmlns:wp14="http://schemas.microsoft.com/office/word/2010/wordprocessingDrawing" xmlns:wp="http://schemas.openxmlformats.org/drawingml/2006/wordprocessingDrawing" xmlns:w10="urn:schemas-microsoft-com:office:word" xmlns:w="http://schemas.openxmlformats.org/wordprocessingml/2006/main" xmlns:w14="http://schemas.microsoft.com/office/word/2010/wordml" xmlns:wpg="http://schemas.microsoft.com/office/word/2010/wordprocessingGroup" xmlns:wpi="http://schemas.microsoft.com/office/word/2010/wordprocessingInk" xmlns:wne="http://schemas.microsoft.com/office/word/2006/wordml" xmlns:wps="http://schemas.microsoft.com/office/word/2010/wordprocessingShape" mc:Ignorable="w14 wp14">
   <w:body>
     <w:p>
-      <w:pPr>
-        <w:rPr>
-          <w:b/>
-          <w:sz w:val="32"/>
-        </w:rPr>
-      </w:pPr>
       <w:r>
-        <w:rPr>
-          <w:rStyle w:val="TitleChar"/>
-          <w:sz w:val="56"/>
-          <w:szCs w:val="56"/>
-        </w:rPr>
-        <w:t xml:space="preserve">Blair </w:t>
-      </w:r>
-      <w:proofErr w:type="spellStart"/>
-      <w:r>
-        <w:rPr>
-          <w:rStyle w:val="TitleChar"/>
-          <w:sz w:val="56"/>
-          <w:szCs w:val="56"/>
-        </w:rPr>
-        <w:t>Gemmer</w:t>
-      </w:r>
-      <w:proofErr w:type="spellEnd"/>
-      <w:r>
-        <w:rPr>
-          <w:b/>
-          <w:sz w:val="32"/>
-        </w:rPr>
-        <w:t xml:space="preserve"> </w:t>
+        <w:t>Blair Gemmer</w:t>
       </w:r>
     </w:p>
     <w:p>
       <w:r>
-        <w:rPr>
-          <w:rStyle w:val="SubtleEmphasis"/>
-          <w:i w:val="0"/>
-        </w:rPr>
-        <w:t>{</w:t>
-      </w:r>
-      <w:hyperlink r:id="rId7" w:history="1">
-        <w:r>
-          <w:rPr>
-            <w:rStyle w:val="SubtleEmphasis"/>
-            <w:i w:val="0"/>
-          </w:rPr>
-          <w:t>blair.gemmer@gmail.com</w:t>
-        </w:r>
-      </w:hyperlink>
-      <w:r>
-        <w:rPr>
-          <w:rStyle w:val="SubtleEmphasis"/>
-          <w:i w:val="0"/>
-        </w:rPr>
-        <w:t xml:space="preserve"> |</w:t>
-      </w:r>
-      <w:r>
-        <w:rPr>
-          <w:rStyle w:val="SubtleEmphasis"/>
-          <w:i w:val="0"/>
-        </w:rPr>
-        <w:t xml:space="preserve"> 406.253.4962</w:t>
-      </w:r>
-      <w:r>
-        <w:rPr>
-          <w:rStyle w:val="SubtleEmphasis"/>
-          <w:i w:val="0"/>
-        </w:rPr>
-        <w:t xml:space="preserve"> | </w:t>
-      </w:r>
-      <w:hyperlink r:id="rId8" w:history="1">
-        <w:r>
-          <w:rPr>
-            <w:rStyle w:val="SubtleEmphasis"/>
-            <w:i w:val="0"/>
-          </w:rPr>
-          <w:t>blairgemmer.com</w:t>
-        </w:r>
-      </w:hyperlink>
-      <w:r>
-        <w:rPr>
-          <w:rStyle w:val="SubtleEmphasis"/>
-          <w:i w:val="0"/>
-        </w:rPr>
-        <w:t xml:space="preserve"> | </w:t>
-      </w:r>
-      <w:hyperlink r:id="rId9" w:history="1">
-        <w:r>
-          <w:rPr>
-            <w:rStyle w:val="SubtleEmphasis"/>
-            <w:i w:val="0"/>
-          </w:rPr>
-          <w:t>linkedin.com/in/</w:t>
-        </w:r>
-        <w:proofErr w:type="spellStart"/>
-        <w:r>
-          <w:rPr>
-            <w:rStyle w:val="SubtleEmphasis"/>
-            <w:i w:val="0"/>
-          </w:rPr>
-          <w:t>blairgemmer</w:t>
-        </w:r>
-        <w:proofErr w:type="spellEnd"/>
-      </w:hyperlink>
-      <w:r>
-        <w:rPr>
-          <w:rStyle w:val="SubtleEmphasis"/>
-          <w:i w:val="0"/>
-        </w:rPr>
-        <w:t>}</w:t>
+        <w:t>{blair.gemmer@gmail.com | 406.253.4962 | blairgemmer.com | linkedin.com/in/blairgemmer}</w:t>
       </w:r>
     </w:p>
-    <w:p>
-      <w:pPr>
-        <w:pBdr>
-          <w:bottom w:val="single" w:sz="6" w:space="1" w:color="000000"/>
-        </w:pBdr>
-        <w:spacing w:line="240" w:lineRule="auto"/>
-      </w:pPr>
-    </w:p>
+    <w:p/>
     <w:p>
       <w:pPr>
         <w:pStyle w:val="Heading1"/>
-        <w:rPr>
-          <w:sz w:val="32"/>
-        </w:rPr>
       </w:pPr>
       <w:r>
-        <w:rPr>
-          <w:sz w:val="32"/>
-        </w:rPr>
         <w:t>Summary</w:t>
       </w:r>
     </w:p>
     <w:p>
-      <w:proofErr w:type="gramStart"/>
       <w:r>
-        <w:t>Full-stack software engineer and technical product strategist specializing in automation, data infrastructure, and cloud-native backends.</w:t>
-      </w:r>
-      <w:proofErr w:type="gramEnd"/>
-      <w:r>
-        <w:t xml:space="preserve"> In the past five years: delivered healthcare and education platforms at scale, led DevOps for high-throughput releases, and built reliable integrations across AWS and modern Python stacks. I focus on systems that reduce toil, surface signal, and ship value quickly.</w:t>
+        <w:t>Self-taught, entrepreneurial software engineer and technical founder who builds systems end-to-end — from AWS-native backends to emerging agentic AI tooling — and cares as much about how something is built as whether it ships. Grew from first-hire engineer to CTO and founder over 15+ years, shipping healthcare, education, and data-infrastructure platforms along the way. Now running Hell's Gate Consulting: building agent-orchestration tooling (RepoScaffold, CueQueue), applying agentic AI where it demonstrably reduces toil, bringing a security-conscious lens from prior security consulting work, contributing back to open source, and partnering with founders building sustainable, resilient businesses.</w:t>
       </w:r>
     </w:p>
     <w:p>
       <w:pPr>
         <w:pStyle w:val="Heading1"/>
-        <w:rPr>
-          <w:sz w:val="32"/>
-        </w:rPr>
       </w:pPr>
       <w:r>
-        <w:rPr>
-          <w:sz w:val="32"/>
-        </w:rPr>
         <w:t>Core Skills</w:t>
       </w:r>
     </w:p>
     <w:p>
+      <w:pPr>
+        <w:pStyle w:val="ListBullet"/>
+      </w:pPr>
       <w:r>
-        <w:rPr>
-          <w:b/>
-        </w:rPr>
-        <w:t>Languages &amp; Frame</w:t>
-      </w:r>
-      <w:bookmarkStart w:id="0" w:name="_GoBack"/>
-      <w:bookmarkEnd w:id="0"/>
-      <w:r>
-        <w:rPr>
-          <w:b/>
-        </w:rPr>
-        <w:t xml:space="preserve">works: </w:t>
-      </w:r>
-      <w:r>
-        <w:t>Python, TypeScript/JavaScript, SQL, React, Next.js</w:t>
+        <w:t>Languages &amp; Frameworks: Python, TypeScript/JavaScript, SQL, React, Next.js</w:t>
       </w:r>
     </w:p>
     <w:p>
+      <w:pPr>
+        <w:pStyle w:val="ListBullet"/>
+      </w:pPr>
       <w:r>
-        <w:rPr>
-          <w:b/>
-        </w:rPr>
-        <w:t xml:space="preserve">Cloud &amp; Infrastructure: </w:t>
-      </w:r>
-      <w:r>
-        <w:t>AWS (Lambda, API Gateway, DynamoDB, RDS, EC2/ELB, Route 53, IAM/ACM, CloudWatch/X-Ray, EventBridge), CloudFormation, Serverless Framework, Docker, Kubernetes</w:t>
+        <w:t>Cloud &amp; Infrastructure: AWS (Lambda, API Gateway, DynamoDB, RDS, EC2/ELB, Route 53, IAM/ACM, CloudWatch/X-Ray, EventBridge), CloudFormation, Serverless Framework, Docker, Kubernetes</w:t>
       </w:r>
     </w:p>
     <w:p>
+      <w:pPr>
+        <w:pStyle w:val="ListBullet"/>
+      </w:pPr>
       <w:r>
-        <w:rPr>
-          <w:b/>
-        </w:rPr>
-        <w:t xml:space="preserve">Data &amp; Pipelines: </w:t>
-      </w:r>
-      <w:r>
-        <w:t>PostgreSQL, Redis, Snowflake, ETL/ingestion, PynamoDB</w:t>
+        <w:t>Data &amp; Pipelines: PostgreSQL, Redis, Snowflake, ETL/ingestion, PynamoDB</w:t>
       </w:r>
     </w:p>
     <w:p>
+      <w:pPr>
+        <w:pStyle w:val="ListBullet"/>
+      </w:pPr>
       <w:r>
-        <w:rPr>
-          <w:b/>
-        </w:rPr>
-        <w:t xml:space="preserve">CI/CD &amp; Quality: </w:t>
-      </w:r>
-      <w:r>
-        <w:t>GitHub Actions, AWS CodePipeline, Bitbucket Pipelines, Tox, Poetry, Pytest, Playwright (E2E), integration/load tests in CI</w:t>
+        <w:t>CI/CD &amp; Quality: GitHub Actions, AWS CodePipeline, Bitbucket Pipelines, Tox, Poetry, Pytest, Playwright (E2E), integration/load tests in CI</w:t>
       </w:r>
     </w:p>
     <w:p>
+      <w:pPr>
+        <w:pStyle w:val="ListBullet"/>
+      </w:pPr>
       <w:r>
-        <w:rPr>
-          <w:b/>
-        </w:rPr>
-        <w:t xml:space="preserve">Product &amp; Collaboration: </w:t>
-      </w:r>
-      <w:r>
-        <w:t>Jira, Linear, Confluence, Slack (bots/integrations)</w:t>
+        <w:t>Product &amp; Collaboration: Jira, Linear, Confluence, Slack (bots/integrations)</w:t>
       </w:r>
     </w:p>
     <w:p>
+      <w:pPr>
+        <w:pStyle w:val="ListBullet"/>
+      </w:pPr>
       <w:r>
-        <w:rPr>
-          <w:b/>
-        </w:rPr>
-        <w:t xml:space="preserve">AI &amp; Automation: </w:t>
+        <w:t>AI &amp; Agentic Systems: Actively researching and adopting agentic AI tooling — Claude Code, MCP, LLM APIs (OpenAI) — building own agent-orchestration tooling (RepoScaffold, CueQueue) and applying it where it demonstrably fits; prototyping with n8n, v0</w:t>
       </w:r>
+    </w:p>
+    <w:p>
+      <w:pPr>
+        <w:pStyle w:val="ListBullet"/>
+      </w:pPr>
       <w:r>
-        <w:t>OpenAI/ChatGPT API, n8n, MCP, v0</w:t>
+        <w:t>Security: Security Consultant experience (LMG Security) — brings a security-first lens to system design, data handling, and infrastructure decisions</w:t>
       </w:r>
     </w:p>
     <w:p>
       <w:pPr>
         <w:pStyle w:val="Heading1"/>
-        <w:rPr>
-          <w:sz w:val="32"/>
-        </w:rPr>
       </w:pPr>
       <w:r>
-        <w:rPr>
-          <w:sz w:val="32"/>
-        </w:rPr>
         <w:t>Professional Experience</w:t>
       </w:r>
     </w:p>
     <w:p>
       <w:r>
-        <w:rPr>
-          <w:b/>
-        </w:rPr>
-        <w:t xml:space="preserve">Freelance Software Engineer / Consultant — Various Clients (Missoula, MT) </w:t>
-      </w:r>
-      <w:r>
-        <w:t>2009–Present</w:t>
+        <w:t>Freelance Software Engineer / Consultant — Various Clients (Missoula, MT)   May 2009 - Present</w:t>
       </w:r>
     </w:p>
     <w:p>
       <w:r>
-        <w:rPr>
-          <w:i/>
-        </w:rPr>
         <w:t>Data infrastructure, AI/automation integrations, and product delivery</w:t>
       </w:r>
     </w:p>
@@ -273,13 +113,7 @@
         <w:pStyle w:val="ListBullet"/>
       </w:pPr>
       <w:r>
-        <w:rPr>
-          <w:b/>
-        </w:rPr>
-        <w:t xml:space="preserve">Intrust Funding / Heaton Dainard (2024–2025): </w:t>
-      </w:r>
-      <w:r>
-        <w:t>Designed real-estate data ingestion and analytics pipelines integrating Snowflake with ATTOM and Salesforce; built Python ETL jobs, automated reporting, and implemented cost controls.</w:t>
+        <w:t>Founder / Hell's Gate Consulting (2026–Present): Established independent technology consulting firm focused on AI implementation strategy, data infrastructure, and workflow automation for startups and growth-stage businesses.</w:t>
       </w:r>
     </w:p>
     <w:p>
@@ -287,13 +121,7 @@
         <w:pStyle w:val="ListBullet"/>
       </w:pPr>
       <w:r>
-        <w:rPr>
-          <w:b/>
-        </w:rPr>
-        <w:t xml:space="preserve">AI/Automation Integrations (2022–2025): </w:t>
-      </w:r>
-      <w:r>
-        <w:t>Built internal tools/bots using OpenAI API and n8n with Slack integrations to automate reporting, summarization, approvals, and human-in-the-loop workflows.</w:t>
+        <w:t>Intrust Funding / Heaton Dainard (2024–Present): Designed and built Frostforce, a generalized ETL platform for ingesting data from any source into Salesforce; initial deployment integrated Snowflake with ATTOM for real-estate analytics; built Python ETL jobs, automated reporting, and implemented cost controls.</w:t>
       </w:r>
     </w:p>
     <w:p>
@@ -301,13 +129,7 @@
         <w:pStyle w:val="ListBullet"/>
       </w:pPr>
       <w:r>
-        <w:rPr>
-          <w:b/>
-        </w:rPr>
-        <w:t xml:space="preserve">Product &amp; Delivery: </w:t>
-      </w:r>
-      <w:r>
-        <w:t>Built and launched cloud-native products and web apps for startups and personal ventures using AWS, React/Next.js, and Django/Flask. Drove end-to-end execution, from architecture and CI/CD automation to team building, project management, and technical operations.</w:t>
+        <w:t>AI/Automation R&amp;D (2022–Present): Actively researching and prototyping agentic AI workflows — OpenAI API, n8n, Slack integrations — for reporting, summarization, and approval automation; building own agent-orchestration tooling (RepoScaffold, CueQueue) rather than relying solely on off-the-shelf platforms.</w:t>
       </w:r>
     </w:p>
     <w:p>
@@ -315,13 +137,7 @@
         <w:pStyle w:val="ListBullet"/>
       </w:pPr>
       <w:r>
-        <w:rPr>
-          <w:b/>
-        </w:rPr>
-        <w:t xml:space="preserve">Tool → outcome: </w:t>
-      </w:r>
-      <w:r>
-        <w:t>Snowflake + Python ETL → partitioned loads and scheduled tasks for leaner storage/compute; n8n + Slack → faster approvals and fewer manual steps.</w:t>
+        <w:t>Product &amp; Delivery: Built and launched cloud-native products and web apps for startups and personal ventures using AWS, React/Next.js, and Django/Flask. Drove end-to-end execution, from architecture and CI/CD automation to team building, project management, and technical operations.</w:t>
       </w:r>
     </w:p>
     <w:p>
@@ -329,33 +145,24 @@
         <w:pStyle w:val="ListBullet"/>
       </w:pPr>
       <w:r>
-        <w:rPr>
-          <w:b/>
-        </w:rPr>
-        <w:lastRenderedPageBreak/>
-        <w:t xml:space="preserve">Stack: </w:t>
+        <w:t>Tool → outcome: Snowflake + Python ETL → partitioned loads and scheduled tasks for leaner storage/compute.</w:t>
       </w:r>
+    </w:p>
+    <w:p>
+      <w:pPr>
+        <w:pStyle w:val="ListBullet"/>
+      </w:pPr>
       <w:r>
-        <w:t>Python, React, Next.js, Django/Flask, PostgreSQL, Redis, Snowflake, REST APIs, GitHub Actions, Serverless approaches, OpenAI API, n8n.</w:t>
+        <w:t>Stack: Python, React, Next.js, Django/Flask, PostgreSQL, Redis, Snowflake, REST APIs, GitHub Actions, Serverless approaches.</w:t>
       </w:r>
     </w:p>
     <w:p>
       <w:r>
-        <w:rPr>
-          <w:b/>
-        </w:rPr>
-        <w:br/>
-        <w:t xml:space="preserve">Software Engineer — VYNYL, LLC (Remote) </w:t>
-      </w:r>
-      <w:r>
-        <w:t>Mar 2021–Apr 2024</w:t>
+        <w:t>Software Engineer — VYNYL, LLC (Remote)   Mar 2021 - Apr 2024</w:t>
       </w:r>
     </w:p>
     <w:p>
       <w:r>
-        <w:rPr>
-          <w:i/>
-        </w:rPr>
         <w:t>Healthcare (Happier Living) • Early Childhood Education (UCSF Multitudes)</w:t>
       </w:r>
     </w:p>
@@ -364,13 +171,7 @@
         <w:pStyle w:val="ListBullet"/>
       </w:pPr>
       <w:r>
-        <w:rPr>
-          <w:b/>
-        </w:rPr>
-        <w:t xml:space="preserve">Product &amp; Backend: </w:t>
-      </w:r>
-      <w:r>
-        <w:t>Built a mobile-responsive healthcare portal integrating Zoom consultations and Athena scheduling using Python on AWS (Lambda, API Gateway) with a modern web front end.</w:t>
+        <w:t>Product &amp; Backend: Built a mobile-responsive healthcare portal integrating Zoom consultations and Athena scheduling using Python on AWS (Lambda, API Gateway) with a modern web front end.</w:t>
       </w:r>
     </w:p>
     <w:p>
@@ -378,13 +179,7 @@
         <w:pStyle w:val="ListBullet"/>
       </w:pPr>
       <w:r>
-        <w:rPr>
-          <w:b/>
-        </w:rPr>
-        <w:t xml:space="preserve">Data &amp; Validation (UCSF Multitudes): </w:t>
-      </w:r>
-      <w:r>
-        <w:t>Implemented Playwright E2E for critical flows; automated CSV→database validation in Python; added CI gates to block ingestion/UI regressions.</w:t>
+        <w:t>Data &amp; Validation (UCSF Multitudes): Implemented Playwright E2E for critical flows; automated CSV→database validation in Python; added CI gates to block ingestion/UI regressions.</w:t>
       </w:r>
     </w:p>
     <w:p>
@@ -392,13 +187,7 @@
         <w:pStyle w:val="ListBullet"/>
       </w:pPr>
       <w:r>
-        <w:rPr>
-          <w:b/>
-        </w:rPr>
-        <w:t xml:space="preserve">Observability &amp; Delivery: </w:t>
-      </w:r>
-      <w:r>
-        <w:t>Modeled operational data in DynamoDB via PynamoDB; AWS X-Ray + CloudWatch for tracing/metrics; Serverless Framework + GitHub Actions for reproducible envs and low-downtime deploys.</w:t>
+        <w:t>Observability &amp; Delivery: Modeled operational data in DynamoDB via PynamoDB; AWS X-Ray + CloudWatch for tracing/metrics; Serverless Framework + GitHub Actions for reproducible envs and low-downtime deploys.</w:t>
       </w:r>
     </w:p>
     <w:p>
@@ -406,13 +195,7 @@
         <w:pStyle w:val="ListBullet"/>
       </w:pPr>
       <w:r>
-        <w:rPr>
-          <w:b/>
-        </w:rPr>
-        <w:t xml:space="preserve">Impact: </w:t>
-      </w:r>
-      <w:r>
-        <w:t>Delivered compliant, reliable clinician workflows and robust data validation across ingestion and UI.</w:t>
+        <w:t>Impact: Delivered compliant, reliable clinician workflows and robust data validation across ingestion and UI.</w:t>
       </w:r>
     </w:p>
     <w:p>
@@ -420,31 +203,16 @@
         <w:pStyle w:val="ListBullet"/>
       </w:pPr>
       <w:r>
-        <w:rPr>
-          <w:b/>
-        </w:rPr>
-        <w:t xml:space="preserve">Stack: </w:t>
-      </w:r>
-      <w:r>
-        <w:t>Python, React, AWS (Lambda, API Gateway, DynamoDB, CloudWatch, X-Ray), Serverless Framework, GitHub Actions, Playwright, Pandas, PynamoDB.</w:t>
+        <w:t>Stack: Python, React, AWS (Lambda, API Gateway, DynamoDB, CloudWatch, X-Ray), Serverless Framework, GitHub Actions, Playwright, Pandas, PynamoDB.</w:t>
       </w:r>
     </w:p>
     <w:p>
       <w:r>
-        <w:rPr>
-          <w:b/>
-        </w:rPr>
-        <w:t xml:space="preserve">Software Engineer, DevOps — Submittable, Inc. (Missoula, MT) </w:t>
-      </w:r>
-      <w:r>
-        <w:t>Sep 2019–Mar 2021</w:t>
+        <w:t>Software Engineer in DevOps — Submittable, Inc. (Missoula, MT)   Sep 2019 - Mar 2021</w:t>
       </w:r>
     </w:p>
     <w:p>
       <w:r>
-        <w:rPr>
-          <w:i/>
-        </w:rPr>
         <w:t>DevOps • Release Engineering • Production Operations</w:t>
       </w:r>
     </w:p>
@@ -453,13 +221,7 @@
         <w:pStyle w:val="ListBullet"/>
       </w:pPr>
       <w:r>
-        <w:rPr>
-          <w:b/>
-        </w:rPr>
-        <w:t xml:space="preserve">Release Engineering: </w:t>
-      </w:r>
-      <w:r>
-        <w:t>Orchestrated SDLC and production releases using AWS CodePipeline; automated comms via GitHub releases and Slack; enforced branch hygiene and quality bars (Pytest/Tox) to stabilize daily deploy cadence.</w:t>
+        <w:t>Release Engineering: Orchestrated SDLC and production releases using AWS CodePipeline; automated comms via GitHub releases and Slack; enforced branch hygiene and quality bars (Pytest/Tox) to stabilize daily deploy cadence.</w:t>
       </w:r>
     </w:p>
     <w:p>
@@ -467,13 +229,7 @@
         <w:pStyle w:val="ListBullet"/>
       </w:pPr>
       <w:r>
-        <w:rPr>
-          <w:b/>
-        </w:rPr>
-        <w:t xml:space="preserve">IaC &amp; Environments: </w:t>
-      </w:r>
-      <w:r>
-        <w:t>Built and maintained test/prod with CloudFormation, Serverless Framework, EventBridge, and Lambda; managed IAM/ACM and Route 53; owned cert rotation and release gating.</w:t>
+        <w:t>IaC &amp; Environments: Built and maintained test/prod with CloudFormation, Serverless Framework, EventBridge, and Lambda; managed IAM/ACM and Route 53; owned cert rotation and release gating.</w:t>
       </w:r>
     </w:p>
     <w:p>
@@ -481,13 +237,7 @@
         <w:pStyle w:val="ListBullet"/>
       </w:pPr>
       <w:r>
-        <w:rPr>
-          <w:b/>
-        </w:rPr>
-        <w:t xml:space="preserve">Observability &amp; Ops: </w:t>
-      </w:r>
-      <w:r>
-        <w:t>CloudWatch dashboards/alerts; on-call with fast rollback/runbooks; Dependabot for dependency hygiene across repos.</w:t>
+        <w:t>Observability &amp; Ops: CloudWatch dashboards/alerts; on-call with fast rollback/runbooks; Dependabot for dependency hygiene across repos.</w:t>
       </w:r>
     </w:p>
     <w:p>
@@ -495,13 +245,7 @@
         <w:pStyle w:val="ListBullet"/>
       </w:pPr>
       <w:r>
-        <w:rPr>
-          <w:b/>
-        </w:rPr>
-        <w:t xml:space="preserve">Impact: </w:t>
-      </w:r>
-      <w:r>
-        <w:t>Reduced deployment overhead ~30% and moved from weekly to daily reliability-focused releases.</w:t>
+        <w:t>Impact: Reduced deployment overhead ~30% and moved from weekly to daily reliability-focused releases.</w:t>
       </w:r>
     </w:p>
     <w:p>
@@ -509,31 +253,16 @@
         <w:pStyle w:val="ListBullet"/>
       </w:pPr>
       <w:r>
-        <w:rPr>
-          <w:b/>
-        </w:rPr>
-        <w:t xml:space="preserve">Stack: </w:t>
-      </w:r>
-      <w:r>
-        <w:t>AWS (CodePipeline, CloudFormation, Lambda, EventBridge, IAM, ACM, EC2, ELB, RDS, Route 53, CloudWatch), Serverless Framework, GitHub, Pytest, Tox.</w:t>
+        <w:t>Stack: AWS (CodePipeline, CloudFormation, Lambda, EventBridge, IAM, ACM, EC2, ELB, RDS, Route 53, CloudWatch), Serverless Framework, GitHub, Pytest, Tox.</w:t>
       </w:r>
     </w:p>
     <w:p>
       <w:r>
-        <w:rPr>
-          <w:b/>
-        </w:rPr>
-        <w:t xml:space="preserve">CTO — TOMIS, Inc. </w:t>
-      </w:r>
-      <w:r>
-        <w:t>Sep 2016–Jul 2019</w:t>
+        <w:t>CTO — TOMIS, Inc.   Sep 2016 - Jul 2019</w:t>
       </w:r>
     </w:p>
     <w:p>
       <w:r>
-        <w:rPr>
-          <w:i/>
-        </w:rPr>
         <w:t>Digital marketing and analytics platform</w:t>
       </w:r>
     </w:p>
@@ -542,13 +271,7 @@
         <w:pStyle w:val="ListBullet"/>
       </w:pPr>
       <w:r>
-        <w:rPr>
-          <w:b/>
-        </w:rPr>
-        <w:t xml:space="preserve">Technical Leadership: </w:t>
-      </w:r>
-      <w:r>
-        <w:t>Owned product design from executive vision through technical implementation; authored detailed technical specifications and delivery plans. Led backend engineering for REST APIs (Python/Django); partnered with React teams on QA and key design decisions. Researched emerging tech; built prototypes and proofs-of-concept to de-risk roadmap bets.</w:t>
+        <w:t>Technical Leadership: Owned product design from executive vision through implementation; led backend engineering (Python/Django) partnering with React teams; researched emerging tech to de-risk roadmap bets.</w:t>
       </w:r>
     </w:p>
     <w:p>
@@ -556,13 +279,7 @@
         <w:pStyle w:val="ListBullet"/>
       </w:pPr>
       <w:r>
-        <w:rPr>
-          <w:b/>
-        </w:rPr>
-        <w:t xml:space="preserve">Project Management: </w:t>
-      </w:r>
-      <w:r>
-        <w:t>Scrum Master: sprint planning, daily standups, retros; administered Jira (boards, workflows, triage) and Confluence docs. Managed Bitbucket repos and branching strategy; integrated Slack for release comms and team coordination. Authored release notes from Jira releases using Confluence templates; prioritized epics using Jira Next-Gen Kanban.</w:t>
+        <w:t>Process &amp; Ops: Ran Scrum (Jira/Confluence, Bitbucket branching/CI); owned observability and incident response (Datadog, Honeycomb, Sentry, UptimeRobot, Statuspage.io).</w:t>
       </w:r>
     </w:p>
     <w:p>
@@ -570,14 +287,7 @@
         <w:pStyle w:val="ListBullet"/>
       </w:pPr>
       <w:r>
-        <w:rPr>
-          <w:b/>
-        </w:rPr>
-        <w:lastRenderedPageBreak/>
-        <w:t xml:space="preserve">DevOps: </w:t>
-      </w:r>
-      <w:r>
-        <w:t>Enforced commit quality and code review processes; maintained feature/release/hotfix branching hygiene. Implemented Bitbucket Pipelines for automated testing on feature branches; tracked bugs/feedback with Usersnap.</w:t>
+        <w:t>Impact: Spearheaded a SaaS platform for tour operators that automated workflows and delivered actionable analytics.</w:t>
       </w:r>
     </w:p>
     <w:p>
@@ -585,59 +295,16 @@
         <w:pStyle w:val="ListBullet"/>
       </w:pPr>
       <w:r>
-        <w:rPr>
-          <w:b/>
-        </w:rPr>
-        <w:t xml:space="preserve">Site Reliability &amp; Observability: </w:t>
-      </w:r>
-      <w:r>
-        <w:t>Production monitoring and tracing with Datadog &amp; Honeycomb; centralized logging and infra monitoring with Stackdriver/Datadog. Exception reporting via Sentry (with Jira integration); uptime and incident comms via UptimeRobot and Statuspage.io.</w:t>
-      </w:r>
-    </w:p>
-    <w:p>
-      <w:pPr>
-        <w:pStyle w:val="ListBullet"/>
-      </w:pPr>
-      <w:r>
-        <w:rPr>
-          <w:b/>
-        </w:rPr>
-        <w:t xml:space="preserve">Impact: </w:t>
-      </w:r>
-      <w:r>
-        <w:t>Spearheaded a SaaS platform for tour operators that automated workflows and delivered actionable analytics.</w:t>
-      </w:r>
-    </w:p>
-    <w:p>
-      <w:pPr>
-        <w:pStyle w:val="ListBullet"/>
-      </w:pPr>
-      <w:r>
-        <w:rPr>
-          <w:b/>
-        </w:rPr>
-        <w:t xml:space="preserve">Stack: </w:t>
-      </w:r>
-      <w:r>
-        <w:t>Python, Django, PostgreSQL; Bitbucket Pipelines; Jira, Confluence, Slack; Datadog, Honeycomb, Stackdriver, Sentry; Usersnap; UptimeRobot, Statuspage.io.</w:t>
+        <w:t>Stack: Python, Django, PostgreSQL, Bitbucket Pipelines, Jira/Confluence, Datadog/Honeycomb/Sentry.</w:t>
       </w:r>
     </w:p>
     <w:p>
       <w:r>
-        <w:rPr>
-          <w:b/>
-        </w:rPr>
-        <w:t xml:space="preserve">Co-Founder / CTO — dotmos, LLC </w:t>
-      </w:r>
-      <w:r>
-        <w:t>Jul 2015–Jan 2017</w:t>
+        <w:t>Co-Founder / CTO — dotmos, LLC   Jul 2015 - Jan 2017</w:t>
       </w:r>
     </w:p>
     <w:p>
       <w:r>
-        <w:rPr>
-          <w:i/>
-        </w:rPr>
         <w:t>Social/search aggregation product &amp; consulting</w:t>
       </w:r>
     </w:p>
@@ -650,35 +317,12 @@
       </w:r>
     </w:p>
     <w:p>
-      <w:pPr>
-        <w:pStyle w:val="ListBullet"/>
-      </w:pPr>
       <w:r>
-        <w:rPr>
-          <w:b/>
-        </w:rPr>
-        <w:t xml:space="preserve">Stack: </w:t>
-      </w:r>
-      <w:r>
-        <w:t>Python/JavaScript, Django/Node/React, SQL; AWS/GCP (as applicable); CI/CD.</w:t>
+        <w:t>Data Scientist / Software Engineer — Upstream Research, Inc.   Nov 2015 - Sep 2016</w:t>
       </w:r>
     </w:p>
     <w:p>
       <w:r>
-        <w:rPr>
-          <w:b/>
-        </w:rPr>
-        <w:t xml:space="preserve">Data Scientist / Software Engineer — Upstream Research, Inc. </w:t>
-      </w:r>
-      <w:r>
-        <w:t>Nov 2015–Sep 2016</w:t>
-      </w:r>
-    </w:p>
-    <w:p>
-      <w:r>
-        <w:rPr>
-          <w:i/>
-        </w:rPr>
         <w:t>Data and research workflows</w:t>
       </w:r>
     </w:p>
@@ -687,48 +331,15 @@
         <w:pStyle w:val="ListBullet"/>
       </w:pPr>
       <w:r>
-        <w:t>Implemented data processing automation and reporting pipelines; built internal dashboards/APIs.</w:t>
-      </w:r>
-    </w:p>
-    <w:p>
-      <w:pPr>
-        <w:pStyle w:val="ListBullet"/>
-      </w:pPr>
-      <w:r>
-        <w:t>Built an ETL pipeline to generate ArcGIS layers from source datasets for geospatial visualization and analysis.</w:t>
-      </w:r>
-    </w:p>
-    <w:p>
-      <w:pPr>
-        <w:pStyle w:val="ListBullet"/>
-      </w:pPr>
-      <w:r>
-        <w:rPr>
-          <w:b/>
-        </w:rPr>
-        <w:t xml:space="preserve">Stack: </w:t>
-      </w:r>
-      <w:r>
-        <w:t>Python, PostgreSQL, ETL tooling, Azure (admin), REST APIs; ArcGIS/ArcPy; ASP.NET MVC (C#).</w:t>
+        <w:t>Built ETL pipelines generating ArcGIS layers and automated reporting/dashboards from research datasets.</w:t>
       </w:r>
     </w:p>
     <w:p>
       <w:pPr>
         <w:pStyle w:val="Heading1"/>
-        <w:rPr>
-          <w:sz w:val="32"/>
-        </w:rPr>
       </w:pPr>
       <w:r>
-        <w:rPr>
-          <w:sz w:val="32"/>
-        </w:rPr>
         <w:t>Additional Experience</w:t>
-      </w:r>
-    </w:p>
-    <w:p>
-      <w:r>
-        <w:t>Security Consultant — LMG Security</w:t>
       </w:r>
     </w:p>
     <w:p>
@@ -739,14 +350,8 @@
     <w:p>
       <w:pPr>
         <w:pStyle w:val="Heading1"/>
-        <w:rPr>
-          <w:sz w:val="32"/>
-        </w:rPr>
       </w:pPr>
       <w:r>
-        <w:rPr>
-          <w:sz w:val="32"/>
-        </w:rPr>
         <w:t>Education</w:t>
       </w:r>
     </w:p>

</xml_diff>

<commit_message>
Remove em dashes across resume, master CV, and minis
Replace em dashes with the dash-free conventions already used
elsewhere in this repo (e.g. resume_em.tex's role macro): "at" for
role/company separators, commas for degree/institution pairs, and
plain prose restructuring in the Summary and Core Skills bullets.
Recompiled all affected PDFs and regenerated the DOCX twin to match.

Co-Authored-By: Claude Sonnet 5 <noreply@anthropic.com>
</commit_message>
<xml_diff>
--- a/docs/word_doc_version/Blair_Gemmer_Resume.docx
+++ b/docs/word_doc_version/Blair_Gemmer_Resume.docx
@@ -23,7 +23,7 @@
     </w:p>
     <w:p>
       <w:r>
-        <w:t>Self-taught, entrepreneurial software engineer and technical founder who builds systems end-to-end — from AWS-native backends to emerging agentic AI tooling — and cares as much about how something is built as whether it ships. Grew from first-hire engineer to CTO and founder over 15+ years, shipping healthcare, education, and data-infrastructure platforms along the way. Now running Hell's Gate Consulting: building agent-orchestration tooling (RepoScaffold, CueQueue), applying agentic AI where it demonstrably reduces toil, bringing a security-conscious lens from prior security consulting work, contributing back to open source, and donating time to local sustainable businesses (e.g., brand identity for Gallus-Frey Gardens, a local farm).</w:t>
+        <w:t>Self-taught, entrepreneurial software engineer and technical founder who builds systems end-to-end, from AWS-native backends to emerging agentic AI tooling, and cares as much about how something is built as whether it ships. Grew from first-hire engineer to CTO and founder over 15+ years, shipping healthcare, education, and data-infrastructure platforms along the way. Now running Hell's Gate Consulting: building agent-orchestration tooling (RepoScaffold, CueQueue), applying agentic AI where it demonstrably reduces toil, bringing a security-conscious lens from prior security consulting work, contributing back to open source, and donating time to local sustainable businesses (e.g., brand identity for Gallus-Frey Gardens, a local farm).</w:t>
       </w:r>
     </w:p>
     <w:p>
@@ -79,7 +79,7 @@
         <w:pStyle w:val="ListBullet"/>
       </w:pPr>
       <w:r>
-        <w:t>AI &amp; Agentic Systems: Actively researching and adopting agentic AI tooling — Claude Code, MCP, LLM APIs (OpenAI) — building own agent-orchestration tooling (RepoScaffold, CueQueue) and applying it where it demonstrably fits; prototyping with n8n, v0</w:t>
+        <w:t>AI &amp; Agentic Systems: Actively researching and adopting agentic AI tooling (Claude Code, MCP, LLM APIs/OpenAI); building own agent-orchestration tooling (RepoScaffold, CueQueue) and applying it where it demonstrably fits; prototyping with n8n, v0</w:t>
       </w:r>
     </w:p>
     <w:p>
@@ -87,7 +87,7 @@
         <w:pStyle w:val="ListBullet"/>
       </w:pPr>
       <w:r>
-        <w:t>Security: Security Consultant experience (LMG Security) — brings a security-first lens to system design, data handling, and infrastructure decisions</w:t>
+        <w:t>Security: Security Consultant experience (LMG Security), bringing a security-first lens to system design, data handling, and infrastructure decisions</w:t>
       </w:r>
     </w:p>
     <w:p>
@@ -100,7 +100,7 @@
     </w:p>
     <w:p>
       <w:r>
-        <w:t>Freelance Software Engineer / Consultant — Various Clients (Missoula, MT)   May 2009 - Present</w:t>
+        <w:t>Freelance Software Engineer / Consultant at Various Clients (Missoula, MT)   May 2009 - Present</w:t>
       </w:r>
     </w:p>
     <w:p>
@@ -129,7 +129,7 @@
         <w:pStyle w:val="ListBullet"/>
       </w:pPr>
       <w:r>
-        <w:t>AI/Automation R&amp;D (2022–Present): Actively researching and prototyping agentic AI workflows — OpenAI API, n8n, Slack integrations — for reporting, summarization, and approval automation; building own agent-orchestration tooling (RepoScaffold, CueQueue) rather than relying solely on off-the-shelf platforms.</w:t>
+        <w:t>AI/Automation R&amp;D (2022–Present): Actively researching and prototyping agentic AI workflows (OpenAI API, n8n, Slack integrations) for reporting, summarization, and approval automation; building own agent-orchestration tooling (RepoScaffold, CueQueue) rather than relying solely on off-the-shelf platforms.</w:t>
       </w:r>
     </w:p>
     <w:p>
@@ -158,7 +158,7 @@
     </w:p>
     <w:p>
       <w:r>
-        <w:t>Software Engineer — VYNYL, LLC (Remote)   Mar 2021 - Apr 2024</w:t>
+        <w:t>Software Engineer at VYNYL, LLC (Remote)   Mar 2021 - Apr 2024</w:t>
       </w:r>
     </w:p>
     <w:p>
@@ -208,7 +208,7 @@
     </w:p>
     <w:p>
       <w:r>
-        <w:t>Software Engineer in DevOps — Submittable, Inc. (Missoula, MT)   Sep 2019 - Mar 2021</w:t>
+        <w:t>Software Engineer in DevOps at Submittable, Inc. (Missoula, MT)   Sep 2019 - Mar 2021</w:t>
       </w:r>
     </w:p>
     <w:p>
@@ -258,7 +258,7 @@
     </w:p>
     <w:p>
       <w:r>
-        <w:t>CTO — TOMIS, Inc.   Sep 2016 - Jul 2019</w:t>
+        <w:t>CTO at TOMIS, Inc.   Sep 2016 - Jul 2019</w:t>
       </w:r>
     </w:p>
     <w:p>
@@ -300,7 +300,7 @@
     </w:p>
     <w:p>
       <w:r>
-        <w:t>Co-Founder / CTO — dotmos, LLC   Jul 2015 - Jan 2017</w:t>
+        <w:t>Co-Founder / CTO at dotmos, LLC   Jul 2015 - Jan 2017</w:t>
       </w:r>
     </w:p>
     <w:p>
@@ -318,7 +318,7 @@
     </w:p>
     <w:p>
       <w:r>
-        <w:t>Data Scientist / Software Engineer — Upstream Research, Inc.   Nov 2015 - Sep 2016</w:t>
+        <w:t>Data Scientist / Software Engineer at Upstream Research, Inc.   Nov 2015 - Sep 2016</w:t>
       </w:r>
     </w:p>
     <w:p>
@@ -344,7 +344,7 @@
     </w:p>
     <w:p>
       <w:r>
-        <w:t>Senior Software Developer — Hanna-James Enterprises</w:t>
+        <w:t>Senior Software Developer at Hanna-James Enterprises</w:t>
       </w:r>
     </w:p>
     <w:p>
@@ -357,12 +357,12 @@
     </w:p>
     <w:p>
       <w:r>
-        <w:t>M.S., Computer Science (AI/ML emphasis) — University of Montana</w:t>
+        <w:t>M.S., Computer Science (AI/ML emphasis), University of Montana</w:t>
       </w:r>
     </w:p>
     <w:p>
       <w:r>
-        <w:t>B.A., Psychology — University of Montana — Minors: Mathematics, Media Arts</w:t>
+        <w:t>B.A., Psychology, University of Montana, Minors: Mathematics, Media Arts</w:t>
       </w:r>
     </w:p>
     <w:sectPr>

</xml_diff>